<commit_message>
Added project for Unit Testing. Added Unit Test for Category class.
</commit_message>
<xml_diff>
--- a/MarketRepo/Database Documentation/TableSpecifications.docx
+++ b/MarketRepo/Database Documentation/TableSpecifications.docx
@@ -67,6 +67,87 @@
         </w:rPr>
         <w:t>Table Reasoning/Rules/Explained</w:t>
       </w:r>
+    </w:p>
+    <w:p>
+      <w:pPr>
+        <w:spacing w:after="0" w:line="240" w:lineRule="auto"/>
+        <w:rPr>
+          <w:rFonts w:ascii="Arial" w:eastAsia="Times New Roman" w:hAnsi="Arial" w:cs="Arial"/>
+          <w:color w:val="000000"/>
+          <w:kern w:val="0"/>
+          <w:lang w:eastAsia="en-CA"/>
+          <w14:ligatures w14:val="none"/>
+        </w:rPr>
+      </w:pPr>
+      <w:r>
+        <w:rPr>
+          <w:rFonts w:ascii="Arial" w:eastAsia="Times New Roman" w:hAnsi="Arial" w:cs="Arial"/>
+          <w:color w:val="000000"/>
+          <w:kern w:val="0"/>
+          <w:lang w:eastAsia="en-CA"/>
+          <w14:ligatures w14:val="none"/>
+        </w:rPr>
+        <w:t>Database has ownership</w:t>
+      </w:r>
+      <w:r>
+        <w:rPr>
+          <w:rFonts w:ascii="Arial" w:eastAsia="Times New Roman" w:hAnsi="Arial" w:cs="Arial"/>
+          <w:color w:val="000000"/>
+          <w:kern w:val="0"/>
+          <w:lang w:eastAsia="en-CA"/>
+          <w14:ligatures w14:val="none"/>
+        </w:rPr>
+        <w:t>/responsibility</w:t>
+      </w:r>
+      <w:r>
+        <w:rPr>
+          <w:rFonts w:ascii="Arial" w:eastAsia="Times New Roman" w:hAnsi="Arial" w:cs="Arial"/>
+          <w:color w:val="000000"/>
+          <w:kern w:val="0"/>
+          <w:lang w:eastAsia="en-CA"/>
+          <w14:ligatures w14:val="none"/>
+        </w:rPr>
+        <w:t xml:space="preserve"> over Primary Key generation for </w:t>
+      </w:r>
+      <w:proofErr w:type="gramStart"/>
+      <w:r>
+        <w:rPr>
+          <w:rFonts w:ascii="Arial" w:eastAsia="Times New Roman" w:hAnsi="Arial" w:cs="Arial"/>
+          <w:color w:val="000000"/>
+          <w:kern w:val="0"/>
+          <w:lang w:eastAsia="en-CA"/>
+          <w14:ligatures w14:val="none"/>
+        </w:rPr>
+        <w:t>ID’s</w:t>
+      </w:r>
+      <w:proofErr w:type="gramEnd"/>
+      <w:r>
+        <w:rPr>
+          <w:rFonts w:ascii="Arial" w:eastAsia="Times New Roman" w:hAnsi="Arial" w:cs="Arial"/>
+          <w:color w:val="000000"/>
+          <w:kern w:val="0"/>
+          <w:lang w:eastAsia="en-CA"/>
+          <w14:ligatures w14:val="none"/>
+        </w:rPr>
+        <w:t>.</w:t>
+      </w:r>
+    </w:p>
+    <w:p>
+      <w:pPr>
+        <w:spacing w:after="0" w:line="240" w:lineRule="auto"/>
+        <w:rPr>
+          <w:rFonts w:ascii="Arial" w:eastAsia="Times New Roman" w:hAnsi="Arial" w:cs="Arial"/>
+          <w:b/>
+          <w:bCs/>
+          <w:color w:val="000000"/>
+          <w:kern w:val="0"/>
+          <w:sz w:val="28"/>
+          <w:szCs w:val="28"/>
+          <w:u w:val="single"/>
+          <w:lang w:eastAsia="en-CA"/>
+          <w14:ligatures w14:val="none"/>
+        </w:rPr>
+      </w:pPr>
     </w:p>
     <w:p>
       <w:pPr>
@@ -1013,6 +1094,7 @@
           <w:lang w:eastAsia="en-CA"/>
           <w14:ligatures w14:val="none"/>
         </w:rPr>
+        <w:lastRenderedPageBreak/>
         <w:t>AuthUser</w:t>
       </w:r>
       <w:proofErr w:type="spellEnd"/>
@@ -1053,7 +1135,6 @@
           <w:lang w:eastAsia="en-CA"/>
           <w14:ligatures w14:val="none"/>
         </w:rPr>
-        <w:lastRenderedPageBreak/>
         <w:t>UserProfile</w:t>
       </w:r>
       <w:proofErr w:type="spellEnd"/>

</xml_diff>